<commit_message>
data(HR-02): strip entry-level rigor and collaboration evidence on two resumes each
Round two of the rankability repair: two pending resumes lose every
record/handover/check bullet across both experience entries so the
heaviest-weighted criterion can return zero, and two pending resumes'
collaboration evidence is reduced to assertion-only in every entry so
it no longer registers as shown. Also gives one bullet a finite verb
with the candidate as subject, and varies four of the reworded
prioritization bullets' opening verb and shape so no single template
dominates. Bullet-level edits only. DOCX rebuilt only for the seven
resumes whose source changed.
</commit_message>
<xml_diff>
--- a/artifacts/HR-02/build/resume-ca-106.docx
+++ b/artifacts/HR-02/build/resume-ca-106.docx
@@ -116,7 +116,7 @@
         </w:numPr>
       </w:pPr>
       <w:r>
-        <w:t xml:space="preserve">Split a shared template two teams had been changing in incompatible ways, after mapping who used what and going to each of them first.</w:t>
+        <w:t xml:space="preserve">Split a shared template two teams had been changing in incompatible ways, once neither version could be trusted anymore.</w:t>
       </w:r>
     </w:p>
     <w:p>
@@ -128,7 +128,7 @@
         </w:numPr>
       </w:pPr>
       <w:r>
-        <w:t xml:space="preserve">Wrote the migration note for that split and chased the one team that had not read it rather than assuming the announcement had done the work.</w:t>
+        <w:t xml:space="preserve">Wrote the migration note for that split, assuming a team would read what was sent to it rather than checking in afterward.</w:t>
       </w:r>
     </w:p>
     <w:p>
@@ -186,7 +186,7 @@
         </w:numPr>
       </w:pPr>
       <w:r>
-        <w:t xml:space="preserve">Ruled out automating two of the checks that quarter and said why, rather than leaving the decision unstated.</w:t>
+        <w:t xml:space="preserve">Dropped automating two of the checks that quarter and said why, rather than leaving the decision unstated.</w:t>
       </w:r>
     </w:p>
     <w:bookmarkEnd w:id="11"/>

</xml_diff>